<commit_message>
Commit all local changes on dev
</commit_message>
<xml_diff>
--- a/TL-thiet-ke-5-buoc.docx
+++ b/TL-thiet-ke-5-buoc.docx
@@ -105,23 +105,7 @@
           <w:color w:val="000000" w:themeColor="text1"/>
           <w:sz w:val="28"/>
         </w:rPr>
-        <w:t>sản xuất điện tử hàng không</w:t>
-      </w:r>
-      <w:r>
-        <w:rPr>
-          <w:rFonts w:cs="Times New Roman"/>
-          <w:color w:val="000000" w:themeColor="text1"/>
-          <w:sz w:val="28"/>
-        </w:rPr>
-        <w:t xml:space="preserve"> </w:t>
-      </w:r>
-      <w:r>
-        <w:rPr>
-          <w:rFonts w:cs="Times New Roman"/>
-          <w:color w:val="000000" w:themeColor="text1"/>
-          <w:sz w:val="28"/>
-        </w:rPr>
-        <w:t>t</w:t>
+        <w:t>sản xuất điện tử hàng không t</w:t>
       </w:r>
       <w:r>
         <w:rPr>
@@ -231,7 +215,7 @@
           <w:color w:val="000000" w:themeColor="text1"/>
           <w:sz w:val="28"/>
         </w:rPr>
-        <w:t>VTX</w:t>
+        <w:t>VRD</w:t>
       </w:r>
     </w:p>
     <w:p>
@@ -257,7 +241,7 @@
           <w:color w:val="000000" w:themeColor="text1"/>
           <w:sz w:val="28"/>
         </w:rPr>
-        <w:t>VTX</w:t>
+        <w:t>VRD</w:t>
       </w:r>
     </w:p>
     <w:p>
@@ -418,15 +402,7 @@
           <w:sz w:val="26"/>
           <w:szCs w:val="26"/>
         </w:rPr>
-        <w:t xml:space="preserve">Với vai trò là một kỹ thuật viên trên dây chuyền lắp ráp </w:t>
-      </w:r>
-      <w:r>
-        <w:rPr>
-          <w:rFonts w:ascii="Times New Roman" w:hAnsi="Times New Roman" w:cs="Times New Roman"/>
-          <w:sz w:val="26"/>
-          <w:szCs w:val="26"/>
-        </w:rPr>
-        <w:t>Anh/chị có thể kể lại chi tiết quá trình lắp ráp và đối soát một module điện tử trong ca làm việc hôm qua diễn ra như thế nào không?</w:t>
+        <w:t>Với vai trò là một kỹ thuật viên trên dây chuyền lắp ráp Anh/chị có thể kể lại chi tiết quá trình lắp ráp và đối soát một module điện tử trong ca làm việc hôm qua diễn ra như thế nào không?</w:t>
       </w:r>
     </w:p>
     <w:p>
@@ -472,39 +448,7 @@
           <w:sz w:val="26"/>
           <w:szCs w:val="26"/>
         </w:rPr>
-        <w:t>Sau khi quẹt thẻ RFID vào trạm, tôi nhận được tập giấy</w:t>
-      </w:r>
-      <w:r>
-        <w:rPr>
-          <w:color w:val="0F1115"/>
-          <w:sz w:val="26"/>
-          <w:szCs w:val="26"/>
-        </w:rPr>
-        <w:t xml:space="preserve"> hướng dẫn công việc trong đó có danh mục vật tư</w:t>
-      </w:r>
-      <w:r>
-        <w:rPr>
-          <w:color w:val="0F1115"/>
-          <w:sz w:val="26"/>
-          <w:szCs w:val="26"/>
-        </w:rPr>
-        <w:t xml:space="preserve"> BOM (</w:t>
-      </w:r>
-      <w:r>
-        <w:rPr>
-          <w:color w:val="0F1115"/>
-          <w:sz w:val="26"/>
-          <w:szCs w:val="26"/>
-        </w:rPr>
-        <w:t>1</w:t>
-      </w:r>
-      <w:r>
-        <w:rPr>
-          <w:color w:val="0F1115"/>
-          <w:sz w:val="26"/>
-          <w:szCs w:val="26"/>
-        </w:rPr>
-        <w:t xml:space="preserve"> trang A4) và một khay linh kiện.</w:t>
+        <w:t>Sau khi quẹt thẻ RFID vào trạm, tôi nhận được tập giấy hướng dẫn công việc trong đó có danh mục vật tư BOM (1 trang A4) và một khay linh kiện.</w:t>
       </w:r>
     </w:p>
     <w:p>
@@ -547,23 +491,7 @@
           <w:sz w:val="26"/>
           <w:szCs w:val="26"/>
         </w:rPr>
-        <w:t> trên túi linh kiện với dòng trong BOM</w:t>
-      </w:r>
-      <w:r>
-        <w:rPr>
-          <w:color w:val="0F1115"/>
-          <w:sz w:val="26"/>
-          <w:szCs w:val="26"/>
-        </w:rPr>
-        <w:t xml:space="preserve"> để biết cần hàn vào vị trí nào</w:t>
-      </w:r>
-      <w:r>
-        <w:rPr>
-          <w:color w:val="0F1115"/>
-          <w:sz w:val="26"/>
-          <w:szCs w:val="26"/>
-        </w:rPr>
-        <w:t>.</w:t>
+        <w:t> trên túi linh kiện với dòng trong BOM để biết cần hàn vào vị trí nào.</w:t>
       </w:r>
     </w:p>
     <w:p>
@@ -647,39 +575,7 @@
           <w:sz w:val="26"/>
           <w:szCs w:val="26"/>
         </w:rPr>
-        <w:t xml:space="preserve">, </w:t>
-      </w:r>
-      <w:r>
-        <w:rPr>
-          <w:color w:val="0F1115"/>
-          <w:sz w:val="26"/>
-          <w:szCs w:val="26"/>
-        </w:rPr>
-        <w:t xml:space="preserve">tôi phải mất </w:t>
-      </w:r>
-      <w:r>
-        <w:rPr>
-          <w:color w:val="0F1115"/>
-          <w:sz w:val="26"/>
-          <w:szCs w:val="26"/>
-        </w:rPr>
-        <w:t>5 phút</w:t>
-      </w:r>
-      <w:r>
-        <w:rPr>
-          <w:color w:val="0F1115"/>
-          <w:sz w:val="26"/>
-          <w:szCs w:val="26"/>
-        </w:rPr>
-        <w:t xml:space="preserve"> để hỏi kỹ sư </w:t>
-      </w:r>
-      <w:r>
-        <w:rPr>
-          <w:color w:val="0F1115"/>
-          <w:sz w:val="26"/>
-          <w:szCs w:val="26"/>
-        </w:rPr>
-        <w:t>QA đi qua xác nhận đó là hàng tương đương.</w:t>
+        <w:t>, tôi phải mất 5 phút để hỏi kỹ sư QA đi qua xác nhận đó là hàng tương đương.</w:t>
       </w:r>
     </w:p>
     <w:p>
@@ -725,31 +621,7 @@
           <w:sz w:val="26"/>
           <w:szCs w:val="26"/>
         </w:rPr>
-        <w:t xml:space="preserve">Hàn </w:t>
-      </w:r>
-      <w:r>
-        <w:rPr>
-          <w:color w:val="0F1115"/>
-          <w:sz w:val="26"/>
-          <w:szCs w:val="26"/>
-        </w:rPr>
-        <w:t>tay</w:t>
-      </w:r>
-      <w:r>
-        <w:rPr>
-          <w:color w:val="0F1115"/>
-          <w:sz w:val="26"/>
-          <w:szCs w:val="26"/>
-        </w:rPr>
-        <w:t xml:space="preserve"> các linh kiện SMD. </w:t>
-      </w:r>
-      <w:r>
-        <w:rPr>
-          <w:color w:val="0F1115"/>
-          <w:sz w:val="26"/>
-          <w:szCs w:val="26"/>
-        </w:rPr>
-        <w:t>Kiểm tra mối hàn bằng mắt.</w:t>
+        <w:t>Hàn tay các linh kiện SMD. Kiểm tra mối hàn bằng mắt.</w:t>
       </w:r>
     </w:p>
     <w:p>
@@ -804,27 +676,7 @@
           <w:sz w:val="26"/>
           <w:szCs w:val="26"/>
         </w:rPr>
-        <w:t xml:space="preserve">Bước 3 – </w:t>
-      </w:r>
-      <w:r>
-        <w:rPr>
-          <w:b/>
-          <w:bCs/>
-          <w:color w:val="0F1115"/>
-          <w:sz w:val="26"/>
-          <w:szCs w:val="26"/>
-        </w:rPr>
-        <w:t>Kiểm soát công đoạn tại chỗ</w:t>
-      </w:r>
-      <w:r>
-        <w:rPr>
-          <w:b/>
-          <w:bCs/>
-          <w:color w:val="0F1115"/>
-          <w:sz w:val="26"/>
-          <w:szCs w:val="26"/>
-        </w:rPr>
-        <w:t xml:space="preserve"> (10h00 – 10h30)</w:t>
+        <w:t>Bước 3 – Kiểm soát công đoạn tại chỗ (10h00 – 10h30)</w:t>
       </w:r>
     </w:p>
     <w:p>
@@ -847,39 +699,7 @@
           <w:sz w:val="26"/>
           <w:szCs w:val="26"/>
         </w:rPr>
-        <w:t>Dừng lắp ráp để điền</w:t>
-      </w:r>
-      <w:r>
-        <w:rPr>
-          <w:color w:val="0F1115"/>
-          <w:sz w:val="26"/>
-          <w:szCs w:val="26"/>
-        </w:rPr>
-        <w:t xml:space="preserve"> tay</w:t>
-      </w:r>
-      <w:r>
-        <w:rPr>
-          <w:color w:val="0F1115"/>
-          <w:sz w:val="26"/>
-          <w:szCs w:val="26"/>
-        </w:rPr>
-        <w:t xml:space="preserve"> “</w:t>
-      </w:r>
-      <w:r>
-        <w:rPr>
-          <w:color w:val="0F1115"/>
-          <w:sz w:val="26"/>
-          <w:szCs w:val="26"/>
-        </w:rPr>
-        <w:t xml:space="preserve">Phiếu kiểm tra </w:t>
-      </w:r>
-      <w:r>
-        <w:rPr>
-          <w:color w:val="0F1115"/>
-          <w:sz w:val="26"/>
-          <w:szCs w:val="26"/>
-        </w:rPr>
-        <w:t>công đoạn”.</w:t>
+        <w:t>Dừng lắp ráp để điền tay “Phiếu kiểm tra công đoạn”.</w:t>
       </w:r>
     </w:p>
     <w:p>
@@ -924,23 +744,7 @@
           <w:sz w:val="26"/>
           <w:szCs w:val="26"/>
         </w:rPr>
-        <w:t>Lúc này, tổ trưởng đến giục vì phía sau đang chờ bo mạch. Tôi phải “làm nhanh” bằng cách chỉ ghi 3 linh kiện quan trọng, bỏ qua các điện trở, tụ</w:t>
-      </w:r>
-      <w:r>
-        <w:rPr>
-          <w:color w:val="0F1115"/>
-          <w:sz w:val="26"/>
-          <w:szCs w:val="26"/>
-        </w:rPr>
-        <w:t>, hoàn thiện biên bản sau, đây là hiện tượng cook biên bản</w:t>
-      </w:r>
-      <w:r>
-        <w:rPr>
-          <w:color w:val="0F1115"/>
-          <w:sz w:val="26"/>
-          <w:szCs w:val="26"/>
-        </w:rPr>
-        <w:t>. </w:t>
+        <w:t>Lúc này, tổ trưởng đến giục vì phía sau đang chờ bo mạch. Tôi phải “làm nhanh” bằng cách chỉ ghi 3 linh kiện quan trọng, bỏ qua các điện trở, tụ, hoàn thiện biên bản sau, đây là hiện tượng cook biên bản. </w:t>
       </w:r>
       <w:r>
         <w:rPr>
@@ -1057,27 +861,7 @@
           <w:sz w:val="26"/>
           <w:szCs w:val="26"/>
         </w:rPr>
-        <w:t xml:space="preserve">Mất 30 phút để hàn lại và </w:t>
-      </w:r>
-      <w:r>
-        <w:rPr>
-          <w:b/>
-          <w:bCs/>
-          <w:color w:val="0F1115"/>
-          <w:sz w:val="26"/>
-          <w:szCs w:val="26"/>
-        </w:rPr>
-        <w:t>kiểm tra lại</w:t>
-      </w:r>
-      <w:r>
-        <w:rPr>
-          <w:b/>
-          <w:bCs/>
-          <w:color w:val="0F1115"/>
-          <w:sz w:val="26"/>
-          <w:szCs w:val="26"/>
-        </w:rPr>
-        <w:t>.</w:t>
+        <w:t>Mất 30 phút để hàn lại và kiểm tra lại.</w:t>
       </w:r>
     </w:p>
     <w:p>
@@ -11291,17 +11075,17 @@
                 <w:szCs w:val="26"/>
                 <w:lang w:val="en-US"/>
               </w:rPr>
-              <w:t xml:space="preserve"> h</w:t>
-            </w:r>
-            <w:proofErr w:type="spellStart"/>
-            <w:r>
-              <w:rPr>
-                <w:rFonts w:ascii="Times New Roman" w:hAnsi="Times New Roman" w:cs="Times New Roman"/>
-                <w:sz w:val="26"/>
-                <w:szCs w:val="26"/>
-                <w:lang w:val="en-US"/>
-              </w:rPr>
-              <w:t>ệ</w:t>
+              <w:t xml:space="preserve"> </w:t>
+            </w:r>
+            <w:proofErr w:type="spellStart"/>
+            <w:r>
+              <w:rPr>
+                <w:rFonts w:ascii="Times New Roman" w:hAnsi="Times New Roman" w:cs="Times New Roman"/>
+                <w:sz w:val="26"/>
+                <w:szCs w:val="26"/>
+                <w:lang w:val="en-US"/>
+              </w:rPr>
+              <w:t>hệ</w:t>
             </w:r>
             <w:proofErr w:type="spellEnd"/>
             <w:r>
@@ -12295,6 +12079,7 @@
                 <w:szCs w:val="26"/>
                 <w:lang w:val="en-US"/>
               </w:rPr>
+              <w:lastRenderedPageBreak/>
               <w:t>Insight</w:t>
             </w:r>
           </w:p>
@@ -17121,6 +16906,7 @@
       <w:r>
         <w:rPr>
           <w:rFonts w:ascii="Times New Roman" w:hAnsi="Times New Roman" w:cs="Times New Roman"/>
+          <w:noProof/>
           <w:sz w:val="26"/>
           <w:szCs w:val="26"/>
           <w:lang w:val="en-US"/>
@@ -17165,6 +16951,9 @@
     </w:p>
     <w:p>
       <w:r>
+        <w:rPr>
+          <w:noProof/>
+        </w:rPr>
         <w:drawing>
           <wp:inline distT="0" distB="0" distL="0" distR="0" wp14:anchorId="4232E7AD" wp14:editId="36B55C03">
             <wp:extent cx="5943600" cy="3238500"/>
@@ -17521,6 +17310,7 @@
       </w:pPr>
       <w:r>
         <w:rPr>
+          <w:noProof/>
           <w:color w:val="0F1115"/>
           <w:sz w:val="26"/>
           <w:szCs w:val="26"/>
@@ -17916,6 +17706,7 @@
       </w:pPr>
       <w:r>
         <w:rPr>
+          <w:noProof/>
           <w:lang w:val="en-US"/>
         </w:rPr>
         <w:drawing>
@@ -20195,8 +19986,13 @@
       </w:r>
       <w:proofErr w:type="spellEnd"/>
       <w:r>
-        <w:t xml:space="preserve"> quan</w:t>
-      </w:r>
+        <w:t xml:space="preserve"> </w:t>
+      </w:r>
+      <w:proofErr w:type="spellStart"/>
+      <w:r>
+        <w:t>quan</w:t>
+      </w:r>
+      <w:proofErr w:type="spellEnd"/>
     </w:p>
     <w:p>
       <w:pPr>
@@ -20206,6 +20002,7 @@
       </w:pPr>
       <w:r>
         <w:rPr>
+          <w:noProof/>
           <w:lang w:val="en-US"/>
         </w:rPr>
         <w:drawing>
@@ -26415,6 +26212,7 @@
   <w:style w:type="character" w:default="1" w:styleId="DefaultParagraphFont">
     <w:name w:val="Default Paragraph Font"/>
     <w:uiPriority w:val="1"/>
+    <w:semiHidden/>
     <w:unhideWhenUsed/>
   </w:style>
   <w:style w:type="table" w:default="1" w:styleId="TableNormal">

</xml_diff>